<commit_message>
Update site (2026-08-12 17:11)
</commit_message>
<xml_diff>
--- a/CRC PA Extra Shifts - Sep-Oct 2026.docx
+++ b/CRC PA Extra Shifts - Sep-Oct 2026.docx
@@ -3825,12 +3825,12 @@
             </w:r>
             <w:r>
               <w:rPr>
-                <w:b w:val="false"/>
-                <w:bCs w:val="false"/>
-                <w:sz w:val="17"/>
-                <w:szCs w:val="17"/>
-              </w:rPr>
-              <w:t xml:space="preserve">TBD</w:t>
+                <w:b/>
+                <w:bCs/>
+                <w:sz w:val="17"/>
+                <w:szCs w:val="17"/>
+              </w:rPr>
+              <w:t xml:space="preserve">Brittany</w:t>
             </w:r>
           </w:p>
         </w:tc>

</xml_diff>

<commit_message>
Update site (2026-08-17 10:33)
</commit_message>
<xml_diff>
--- a/CRC PA Extra Shifts - Sep-Oct 2026.docx
+++ b/CRC PA Extra Shifts - Sep-Oct 2026.docx
@@ -30,7 +30,7 @@
           <w:sz w:val="18"/>
           <w:szCs w:val="18"/>
         </w:rPr>
-        <w:t xml:space="preserve">Bold evening names are newly assigned from the extra-shift request round (Aug 2026). Remaining TBD shifts are available first-come, first-served.</w:t>
+        <w:t xml:space="preserve">Bold names are newly assigned from the August 2026 extra-shift request rounds (PAs by first name, residents by last name). Remaining TBD shifts are available first-come, first-served.</w:t>
       </w:r>
     </w:p>
     <w:p>
@@ -321,12 +321,12 @@
             </w:r>
             <w:r>
               <w:rPr>
-                <w:b w:val="false"/>
-                <w:bCs w:val="false"/>
-                <w:sz w:val="17"/>
-                <w:szCs w:val="17"/>
-              </w:rPr>
-              <w:t xml:space="preserve">TBD</w:t>
+                <w:b/>
+                <w:bCs/>
+                <w:sz w:val="17"/>
+                <w:szCs w:val="17"/>
+              </w:rPr>
+              <w:t xml:space="preserve">Erdstein</w:t>
             </w:r>
           </w:p>
         </w:tc>
@@ -1149,12 +1149,12 @@
             </w:r>
             <w:r>
               <w:rPr>
-                <w:b w:val="false"/>
-                <w:bCs w:val="false"/>
-                <w:sz w:val="17"/>
-                <w:szCs w:val="17"/>
-              </w:rPr>
-              <w:t xml:space="preserve">TBD</w:t>
+                <w:b/>
+                <w:bCs/>
+                <w:sz w:val="17"/>
+                <w:szCs w:val="17"/>
+              </w:rPr>
+              <w:t xml:space="preserve">Dueck</w:t>
             </w:r>
           </w:p>
         </w:tc>
@@ -1326,12 +1326,12 @@
             </w:r>
             <w:r>
               <w:rPr>
-                <w:b w:val="false"/>
-                <w:bCs w:val="false"/>
-                <w:sz w:val="17"/>
-                <w:szCs w:val="17"/>
-              </w:rPr>
-              <w:t xml:space="preserve">TBD</w:t>
+                <w:b/>
+                <w:bCs/>
+                <w:sz w:val="17"/>
+                <w:szCs w:val="17"/>
+              </w:rPr>
+              <w:t xml:space="preserve">Cianflone</w:t>
             </w:r>
           </w:p>
         </w:tc>
@@ -1741,12 +1741,12 @@
             </w:r>
             <w:r>
               <w:rPr>
-                <w:b w:val="false"/>
-                <w:bCs w:val="false"/>
-                <w:sz w:val="17"/>
-                <w:szCs w:val="17"/>
-              </w:rPr>
-              <w:t xml:space="preserve">TBD</w:t>
+                <w:b/>
+                <w:bCs/>
+                <w:sz w:val="17"/>
+                <w:szCs w:val="17"/>
+              </w:rPr>
+              <w:t xml:space="preserve">Cianflone</w:t>
             </w:r>
           </w:p>
         </w:tc>
@@ -1800,12 +1800,12 @@
             </w:r>
             <w:r>
               <w:rPr>
-                <w:b w:val="false"/>
-                <w:bCs w:val="false"/>
-                <w:sz w:val="17"/>
-                <w:szCs w:val="17"/>
-              </w:rPr>
-              <w:t xml:space="preserve">TBD</w:t>
+                <w:b/>
+                <w:bCs/>
+                <w:sz w:val="17"/>
+                <w:szCs w:val="17"/>
+              </w:rPr>
+              <w:t xml:space="preserve">Manocha</w:t>
             </w:r>
           </w:p>
         </w:tc>
@@ -1838,33 +1838,33 @@
             </w:r>
             <w:r>
               <w:rPr>
-                <w:b w:val="false"/>
-                <w:bCs w:val="false"/>
-                <w:sz w:val="17"/>
-                <w:szCs w:val="17"/>
-              </w:rPr>
-              <w:t xml:space="preserve">TBD</w:t>
-            </w:r>
-          </w:p>
-          <w:p>
-            <w:r>
-              <w:rPr>
-                <w:b/>
-                <w:bCs/>
-                <w:color w:val="2C7A7B"/>
-                <w:sz w:val="17"/>
-                <w:szCs w:val="17"/>
-              </w:rPr>
-              <w:t xml:space="preserve">Eve: </w:t>
-            </w:r>
-            <w:r>
-              <w:rPr>
-                <w:b w:val="false"/>
-                <w:bCs w:val="false"/>
-                <w:sz w:val="17"/>
-                <w:szCs w:val="17"/>
-              </w:rPr>
-              <w:t xml:space="preserve">TBD</w:t>
+                <w:b/>
+                <w:bCs/>
+                <w:sz w:val="17"/>
+                <w:szCs w:val="17"/>
+              </w:rPr>
+              <w:t xml:space="preserve">Wachal</w:t>
+            </w:r>
+          </w:p>
+          <w:p>
+            <w:r>
+              <w:rPr>
+                <w:b/>
+                <w:bCs/>
+                <w:color w:val="2C7A7B"/>
+                <w:sz w:val="17"/>
+                <w:szCs w:val="17"/>
+              </w:rPr>
+              <w:t xml:space="preserve">Eve: </w:t>
+            </w:r>
+            <w:r>
+              <w:rPr>
+                <w:b/>
+                <w:bCs/>
+                <w:sz w:val="17"/>
+                <w:szCs w:val="17"/>
+              </w:rPr>
+              <w:t xml:space="preserve">Siemens</w:t>
             </w:r>
           </w:p>
         </w:tc>
@@ -2559,12 +2559,12 @@
             </w:r>
             <w:r>
               <w:rPr>
-                <w:b w:val="false"/>
-                <w:bCs w:val="false"/>
-                <w:sz w:val="17"/>
-                <w:szCs w:val="17"/>
-              </w:rPr>
-              <w:t xml:space="preserve">TBD</w:t>
+                <w:b/>
+                <w:bCs/>
+                <w:sz w:val="17"/>
+                <w:szCs w:val="17"/>
+              </w:rPr>
+              <w:t xml:space="preserve">Siemens</w:t>
             </w:r>
           </w:p>
           <w:p>
@@ -2620,12 +2620,12 @@
             </w:r>
             <w:r>
               <w:rPr>
-                <w:b w:val="false"/>
-                <w:bCs w:val="false"/>
-                <w:sz w:val="17"/>
-                <w:szCs w:val="17"/>
-              </w:rPr>
-              <w:t xml:space="preserve">TBD</w:t>
+                <w:b/>
+                <w:bCs/>
+                <w:sz w:val="17"/>
+                <w:szCs w:val="17"/>
+              </w:rPr>
+              <w:t xml:space="preserve">Manocha</w:t>
             </w:r>
           </w:p>
           <w:p>
@@ -2974,33 +2974,33 @@
             </w:r>
             <w:r>
               <w:rPr>
-                <w:b w:val="false"/>
-                <w:bCs w:val="false"/>
-                <w:sz w:val="17"/>
-                <w:szCs w:val="17"/>
-              </w:rPr>
-              <w:t xml:space="preserve">TBD</w:t>
-            </w:r>
-          </w:p>
-          <w:p>
-            <w:r>
-              <w:rPr>
-                <w:b/>
-                <w:bCs/>
-                <w:color w:val="2C7A7B"/>
-                <w:sz w:val="17"/>
-                <w:szCs w:val="17"/>
-              </w:rPr>
-              <w:t xml:space="preserve">Eve: </w:t>
-            </w:r>
-            <w:r>
-              <w:rPr>
-                <w:b w:val="false"/>
-                <w:bCs w:val="false"/>
-                <w:sz w:val="17"/>
-                <w:szCs w:val="17"/>
-              </w:rPr>
-              <w:t xml:space="preserve">TBD</w:t>
+                <w:b/>
+                <w:bCs/>
+                <w:sz w:val="17"/>
+                <w:szCs w:val="17"/>
+              </w:rPr>
+              <w:t xml:space="preserve">Wachal</w:t>
+            </w:r>
+          </w:p>
+          <w:p>
+            <w:r>
+              <w:rPr>
+                <w:b/>
+                <w:bCs/>
+                <w:color w:val="2C7A7B"/>
+                <w:sz w:val="17"/>
+                <w:szCs w:val="17"/>
+              </w:rPr>
+              <w:t xml:space="preserve">Eve: </w:t>
+            </w:r>
+            <w:r>
+              <w:rPr>
+                <w:b/>
+                <w:bCs/>
+                <w:sz w:val="17"/>
+                <w:szCs w:val="17"/>
+              </w:rPr>
+              <w:t xml:space="preserve">Wachal</w:t>
             </w:r>
           </w:p>
         </w:tc>
@@ -3389,33 +3389,33 @@
             </w:r>
             <w:r>
               <w:rPr>
-                <w:b w:val="false"/>
-                <w:bCs w:val="false"/>
-                <w:sz w:val="17"/>
-                <w:szCs w:val="17"/>
-              </w:rPr>
-              <w:t xml:space="preserve">TBD</w:t>
-            </w:r>
-          </w:p>
-          <w:p>
-            <w:r>
-              <w:rPr>
-                <w:b/>
-                <w:bCs/>
-                <w:color w:val="2C7A7B"/>
-                <w:sz w:val="17"/>
-                <w:szCs w:val="17"/>
-              </w:rPr>
-              <w:t xml:space="preserve">Eve: </w:t>
-            </w:r>
-            <w:r>
-              <w:rPr>
-                <w:b w:val="false"/>
-                <w:bCs w:val="false"/>
-                <w:sz w:val="17"/>
-                <w:szCs w:val="17"/>
-              </w:rPr>
-              <w:t xml:space="preserve">TBD</w:t>
+                <w:b/>
+                <w:bCs/>
+                <w:sz w:val="17"/>
+                <w:szCs w:val="17"/>
+              </w:rPr>
+              <w:t xml:space="preserve">Gregoire-Mitha</w:t>
+            </w:r>
+          </w:p>
+          <w:p>
+            <w:r>
+              <w:rPr>
+                <w:b/>
+                <w:bCs/>
+                <w:color w:val="2C7A7B"/>
+                <w:sz w:val="17"/>
+                <w:szCs w:val="17"/>
+              </w:rPr>
+              <w:t xml:space="preserve">Eve: </w:t>
+            </w:r>
+            <w:r>
+              <w:rPr>
+                <w:b/>
+                <w:bCs/>
+                <w:sz w:val="17"/>
+                <w:szCs w:val="17"/>
+              </w:rPr>
+              <w:t xml:space="preserve">Hawkins</w:t>
             </w:r>
           </w:p>
         </w:tc>
@@ -3450,33 +3450,33 @@
             </w:r>
             <w:r>
               <w:rPr>
-                <w:b w:val="false"/>
-                <w:bCs w:val="false"/>
-                <w:sz w:val="17"/>
-                <w:szCs w:val="17"/>
-              </w:rPr>
-              <w:t xml:space="preserve">TBD</w:t>
-            </w:r>
-          </w:p>
-          <w:p>
-            <w:r>
-              <w:rPr>
-                <w:b/>
-                <w:bCs/>
-                <w:color w:val="2C7A7B"/>
-                <w:sz w:val="17"/>
-                <w:szCs w:val="17"/>
-              </w:rPr>
-              <w:t xml:space="preserve">Eve: </w:t>
-            </w:r>
-            <w:r>
-              <w:rPr>
-                <w:b w:val="false"/>
-                <w:bCs w:val="false"/>
-                <w:sz w:val="17"/>
-                <w:szCs w:val="17"/>
-              </w:rPr>
-              <w:t xml:space="preserve">TBD</w:t>
+                <w:b/>
+                <w:bCs/>
+                <w:sz w:val="17"/>
+                <w:szCs w:val="17"/>
+              </w:rPr>
+              <w:t xml:space="preserve">Siemens</w:t>
+            </w:r>
+          </w:p>
+          <w:p>
+            <w:r>
+              <w:rPr>
+                <w:b/>
+                <w:bCs/>
+                <w:color w:val="2C7A7B"/>
+                <w:sz w:val="17"/>
+                <w:szCs w:val="17"/>
+              </w:rPr>
+              <w:t xml:space="preserve">Eve: </w:t>
+            </w:r>
+            <w:r>
+              <w:rPr>
+                <w:b/>
+                <w:bCs/>
+                <w:sz w:val="17"/>
+                <w:szCs w:val="17"/>
+              </w:rPr>
+              <w:t xml:space="preserve">Gregoire-Mitha</w:t>
             </w:r>
           </w:p>
         </w:tc>
@@ -3865,12 +3865,12 @@
             </w:r>
             <w:r>
               <w:rPr>
-                <w:b w:val="false"/>
-                <w:bCs w:val="false"/>
-                <w:sz w:val="17"/>
-                <w:szCs w:val="17"/>
-              </w:rPr>
-              <w:t xml:space="preserve">TBD</w:t>
+                <w:b/>
+                <w:bCs/>
+                <w:sz w:val="17"/>
+                <w:szCs w:val="17"/>
+              </w:rPr>
+              <w:t xml:space="preserve">Siemens</w:t>
             </w:r>
           </w:p>
           <w:p>

</xml_diff>